<commit_message>
SRS document - updated
</commit_message>
<xml_diff>
--- a/Smart_Expense_Budget_Management_SRS.docx
+++ b/Smart_Expense_Budget_Management_SRS.docx
@@ -151,7 +151,7 @@
       <w:tr>
         <w:tc>
           <w:tcPr>
-            <w:tcW w:w="5184" w:type="dxa"/>
+            <w:tcW w:w="5179" w:type="dxa"/>
           </w:tcPr>
           <w:p>
             <w:pPr>
@@ -170,7 +170,7 @@
         </w:tc>
         <w:tc>
           <w:tcPr>
-            <w:tcW w:w="5184" w:type="dxa"/>
+            <w:tcW w:w="5179" w:type="dxa"/>
           </w:tcPr>
           <w:p>
             <w:pPr>
@@ -190,7 +190,7 @@
       <w:tr>
         <w:tc>
           <w:tcPr>
-            <w:tcW w:w="5184" w:type="dxa"/>
+            <w:tcW w:w="5179" w:type="dxa"/>
           </w:tcPr>
           <w:p>
             <w:pPr>
@@ -209,7 +209,7 @@
         </w:tc>
         <w:tc>
           <w:tcPr>
-            <w:tcW w:w="5184" w:type="dxa"/>
+            <w:tcW w:w="5179" w:type="dxa"/>
           </w:tcPr>
           <w:p>
             <w:pPr>
@@ -229,7 +229,7 @@
       <w:tr>
         <w:tc>
           <w:tcPr>
-            <w:tcW w:w="5184" w:type="dxa"/>
+            <w:tcW w:w="5179" w:type="dxa"/>
           </w:tcPr>
           <w:p>
             <w:pPr>
@@ -248,19 +248,19 @@
         </w:tc>
         <w:tc>
           <w:tcPr>
-            <w:tcW w:w="5184" w:type="dxa"/>
-          </w:tcPr>
-          <w:p>
-            <w:pPr>
-              <w:rPr>
-                <w:rFonts w:ascii="Times New Roman" w:hAnsi="Times New Roman" w:cs="Times New Roman"/>
-              </w:rPr>
-            </w:pPr>
-            <w:r>
-              <w:rPr>
-                <w:rFonts w:ascii="Times New Roman" w:hAnsi="Times New Roman" w:cs="Times New Roman"/>
-              </w:rPr>
-              <w:t>BHU VIGNA REDDY A T</w:t>
+            <w:tcW w:w="5179" w:type="dxa"/>
+          </w:tcPr>
+          <w:p>
+            <w:pPr>
+              <w:rPr>
+                <w:rFonts w:ascii="Times New Roman" w:hAnsi="Times New Roman" w:cs="Times New Roman"/>
+              </w:rPr>
+            </w:pPr>
+            <w:r>
+              <w:rPr>
+                <w:rFonts w:ascii="Times New Roman" w:hAnsi="Times New Roman" w:cs="Times New Roman"/>
+              </w:rPr>
+              <w:t>BHUVIGNA REDDY A T</w:t>
             </w:r>
             <w:r>
               <w:rPr>
@@ -289,38 +289,41 @@
       <w:tr>
         <w:tc>
           <w:tcPr>
-            <w:tcW w:w="5184" w:type="dxa"/>
-          </w:tcPr>
-          <w:p>
-            <w:pPr>
-              <w:rPr>
-                <w:rFonts w:ascii="Times New Roman" w:hAnsi="Times New Roman" w:cs="Times New Roman"/>
-              </w:rPr>
-            </w:pPr>
-            <w:r>
+            <w:tcW w:w="5179" w:type="dxa"/>
+          </w:tcPr>
+          <w:p>
+            <w:pPr>
               <w:rPr>
                 <w:rFonts w:ascii="Times New Roman" w:hAnsi="Times New Roman" w:cs="Times New Roman"/>
                 <w:b/>
               </w:rPr>
-              <w:t>Date</w:t>
-            </w:r>
-          </w:p>
-        </w:tc>
-        <w:tc>
-          <w:tcPr>
-            <w:tcW w:w="5184" w:type="dxa"/>
-          </w:tcPr>
-          <w:p>
-            <w:pPr>
-              <w:rPr>
-                <w:rFonts w:ascii="Times New Roman" w:hAnsi="Times New Roman" w:cs="Times New Roman"/>
-              </w:rPr>
-            </w:pPr>
-            <w:r>
-              <w:rPr>
-                <w:rFonts w:ascii="Times New Roman" w:hAnsi="Times New Roman" w:cs="Times New Roman"/>
-              </w:rPr>
-              <w:t>04-09-2026</w:t>
+            </w:pPr>
+            <w:r>
+              <w:rPr>
+                <w:rFonts w:ascii="Times New Roman" w:hAnsi="Times New Roman" w:cs="Times New Roman"/>
+                <w:b/>
+              </w:rPr>
+              <w:t>SRN</w:t>
+            </w:r>
+          </w:p>
+        </w:tc>
+        <w:tc>
+          <w:tcPr>
+            <w:tcW w:w="5179" w:type="dxa"/>
+          </w:tcPr>
+          <w:p>
+            <w:pPr>
+              <w:rPr>
+                <w:rFonts w:ascii="Times New Roman" w:hAnsi="Times New Roman" w:cs="Times New Roman"/>
+              </w:rPr>
+            </w:pPr>
+            <w:r>
+              <w:rPr>
+                <w:rFonts w:ascii="Times New Roman" w:hAnsi="Times New Roman" w:cs="Times New Roman"/>
+                <w:sz w:val="18"/>
+                <w:szCs w:val="18"/>
+              </w:rPr>
+              <w:t>PES2UG24CS119, PES2UG24CS120, PES2UG24CS122, PES2UG24CS123</w:t>
             </w:r>
           </w:p>
         </w:tc>
@@ -328,7 +331,7 @@
       <w:tr>
         <w:tc>
           <w:tcPr>
-            <w:tcW w:w="5184" w:type="dxa"/>
+            <w:tcW w:w="5179" w:type="dxa"/>
           </w:tcPr>
           <w:p>
             <w:pPr>
@@ -341,13 +344,52 @@
                 <w:rFonts w:ascii="Times New Roman" w:hAnsi="Times New Roman" w:cs="Times New Roman"/>
                 <w:b/>
               </w:rPr>
+              <w:t>Date</w:t>
+            </w:r>
+          </w:p>
+        </w:tc>
+        <w:tc>
+          <w:tcPr>
+            <w:tcW w:w="5179" w:type="dxa"/>
+          </w:tcPr>
+          <w:p>
+            <w:pPr>
+              <w:rPr>
+                <w:rFonts w:ascii="Times New Roman" w:hAnsi="Times New Roman" w:cs="Times New Roman"/>
+              </w:rPr>
+            </w:pPr>
+            <w:r>
+              <w:rPr>
+                <w:rFonts w:ascii="Times New Roman" w:hAnsi="Times New Roman" w:cs="Times New Roman"/>
+              </w:rPr>
+              <w:t>04-09-2026</w:t>
+            </w:r>
+          </w:p>
+        </w:tc>
+      </w:tr>
+      <w:tr>
+        <w:tc>
+          <w:tcPr>
+            <w:tcW w:w="5179" w:type="dxa"/>
+          </w:tcPr>
+          <w:p>
+            <w:pPr>
+              <w:rPr>
+                <w:rFonts w:ascii="Times New Roman" w:hAnsi="Times New Roman" w:cs="Times New Roman"/>
+              </w:rPr>
+            </w:pPr>
+            <w:r>
+              <w:rPr>
+                <w:rFonts w:ascii="Times New Roman" w:hAnsi="Times New Roman" w:cs="Times New Roman"/>
+                <w:b/>
+              </w:rPr>
               <w:t>Status</w:t>
             </w:r>
           </w:p>
         </w:tc>
         <w:tc>
           <w:tcPr>
-            <w:tcW w:w="5184" w:type="dxa"/>
+            <w:tcW w:w="5179" w:type="dxa"/>
           </w:tcPr>
           <w:p>
             <w:pPr>
@@ -10995,7 +11037,23 @@
                 <w:rFonts w:ascii="Times New Roman" w:hAnsi="Times New Roman" w:cs="Times New Roman"/>
                 <w:sz w:val="16"/>
               </w:rPr>
-              <w:t>The system shall avoid logging passwords, aut...</w:t>
+              <w:t xml:space="preserve">The system shall avoid logging passwords, </w:t>
+            </w:r>
+            <w:proofErr w:type="spellStart"/>
+            <w:r>
+              <w:rPr>
+                <w:rFonts w:ascii="Times New Roman" w:hAnsi="Times New Roman" w:cs="Times New Roman"/>
+                <w:sz w:val="16"/>
+              </w:rPr>
+              <w:t>aut</w:t>
+            </w:r>
+            <w:proofErr w:type="spellEnd"/>
+            <w:r>
+              <w:rPr>
+                <w:rFonts w:ascii="Times New Roman" w:hAnsi="Times New Roman" w:cs="Times New Roman"/>
+                <w:sz w:val="16"/>
+              </w:rPr>
+              <w:t>...</w:t>
             </w:r>
           </w:p>
         </w:tc>

</xml_diff>